<commit_message>
feat: premium grants & rewards, referral invite (r.html + vercel rewrite), collectz join approval, business dashboards, quick-log promo modal
Parallel-session batch verified green (typecheck + full tsx suite) before commit:
- Premium: entitlements service, grants & rewards migration, RedeemCode,
  InviteFriends, PurchaseResultModal, tiers/premiumStore updates
- Referral: site/r.html invite landing + vercel.json rewrite, subscription docx data
- Collectz: join-approval migration + screens/service updates
- Business dashboards (freelancer/mixed/ontheroad/parttime), PullRefresh,
  QuickLogPromoModal, EchoInlineChat/store, misc screens + i18n
- Site: BM copy refinements (index/admin/privacy/site.css)
</commit_message>
<xml_diff>
--- a/Potraces_Subscription_and_Echo_Guide.docx
+++ b/Potraces_Subscription_and_Echo_Guide.docx
@@ -2793,6 +2793,98 @@
                 <w:sz w:val="20"/>
               </w:rPr>
               <w:t>tiers.ts:60,70,80,90. Off on free; on Basic+.</w:t>
+            </w:r>
+          </w:p>
+        </w:tc>
+      </w:tr>
+      <w:tr>
+        <w:tc>
+          <w:tcPr>
+            <w:tcW w:type="dxa" w:w="2448"/>
+          </w:tcPr>
+          <w:p>
+            <w:r/>
+            <w:r>
+              <w:rPr>
+                <w:b w:val="0"/>
+                <w:sz w:val="20"/>
+              </w:rPr>
+              <w:t>Payment QR codes stored (per mode — personal and business lists each)</w:t>
+            </w:r>
+          </w:p>
+        </w:tc>
+        <w:tc>
+          <w:tcPr>
+            <w:tcW w:type="dxa" w:w="1008"/>
+          </w:tcPr>
+          <w:p>
+            <w:r/>
+            <w:r>
+              <w:rPr>
+                <w:b w:val="0"/>
+                <w:sz w:val="20"/>
+              </w:rPr>
+              <w:t>2</w:t>
+            </w:r>
+          </w:p>
+        </w:tc>
+        <w:tc>
+          <w:tcPr>
+            <w:tcW w:type="dxa" w:w="1008"/>
+          </w:tcPr>
+          <w:p>
+            <w:r/>
+            <w:r>
+              <w:rPr>
+                <w:b w:val="0"/>
+                <w:sz w:val="20"/>
+              </w:rPr>
+              <w:t>4</w:t>
+            </w:r>
+          </w:p>
+        </w:tc>
+        <w:tc>
+          <w:tcPr>
+            <w:tcW w:type="dxa" w:w="1008"/>
+          </w:tcPr>
+          <w:p>
+            <w:r/>
+            <w:r>
+              <w:rPr>
+                <w:b w:val="0"/>
+                <w:sz w:val="20"/>
+              </w:rPr>
+              <w:t>Unlimited</w:t>
+            </w:r>
+          </w:p>
+        </w:tc>
+        <w:tc>
+          <w:tcPr>
+            <w:tcW w:type="dxa" w:w="1152"/>
+          </w:tcPr>
+          <w:p>
+            <w:r/>
+            <w:r>
+              <w:rPr>
+                <w:b w:val="0"/>
+                <w:sz w:val="20"/>
+              </w:rPr>
+              <w:t>Unlimited</w:t>
+            </w:r>
+          </w:p>
+        </w:tc>
+        <w:tc>
+          <w:tcPr>
+            <w:tcW w:type="dxa" w:w="2304"/>
+          </w:tcPr>
+          <w:p>
+            <w:r/>
+            <w:r>
+              <w:rPr>
+                <w:b w:val="0"/>
+                <w:sz w:val="20"/>
+              </w:rPr>
+              <w:t>tiers.ts (maxPaymentQrs). Concurrent count cap per mode, no reset. Free keeps the legacy 2, Basic 4, Pro+ unlimited per the count-feature principle. Grandfathering: only the NEXT add is blocked, existing QRs are never deleted. Gate: PaymentQrCard Add slot -&gt; paywall (paywall feature paymentQr); scan-standee add follows the same gate.</w:t>
             </w:r>
           </w:p>
         </w:tc>

</xml_diff>

<commit_message>
docs: sync Subscription & Echo guide with Echo's Notebook (locked rule)
- echo.whereUsed/otherNotes/sources: notebook screen, learning store
  mechanics (trust>=2, conflict demote, 100-cap), privacy note
- screens: EchoNotebook row — ungated, no AI call, edits the rule tables
  that feed Echo's prompt
- regenerated docx via make_docx.py (204 paragraphs, 4 tables)
</commit_message>
<xml_diff>
--- a/Potraces_Subscription_and_Echo_Guide.docx
+++ b/Potraces_Subscription_and_Echo_Guide.docx
@@ -655,6 +655,14 @@
       </w:pPr>
       <w:r>
         <w:t>Optional once-a-day check-in greeting shown inside the chat when the echoDailyCheckin setting is on — MoneyChat.tsx:1231-1285.</w:t>
+      </w:r>
+    </w:p>
+    <w:p>
+      <w:pPr>
+        <w:pStyle w:val="ListBullet"/>
+      </w:pPr>
+      <w:r>
+        <w:t>Echo's Notebook screen (Settings &gt; Echo's Notebook) — src/screens/personal/EchoNotebook.tsx. A visible, editable render of the learning notebook (learningStore): every rule Echo learned from the user's corrections (merchant→category, person aliases, wallet preferences), with counts. Users can add their own rules manually, fix or forget any rule, and reset all. No AI call happens here — it edits the local rule tables that later feed Echo's prompt (moneyChat.ts:939 getPromptHints) and the capture paths' auto-fills.</w:t>
       </w:r>
     </w:p>
     <w:p>
@@ -754,7 +762,7 @@
           <w:color w:val="6A6A6A"/>
           <w:sz w:val="20"/>
         </w:rPr>
-        <w:t>Free users effectively can only chat with Echo from the dedicated Money Chat screen; the floating Echo button on Budget/Pulse/Savings/Subscriptions/Wallet is locked for them (askEchoPerScreen:false, tiers.ts:60) and opens the paywall. Note the metered AI cap stays finite even at Premium (1500/mo) by design — cost-metered features never go unlimited (tiers.ts:9-12,29-31). The reset is monthly for AI calls (there is no daily-chat concept); the only daily concept is the optional check-in greeting, which doesn't consume the quota.</w:t>
+        <w:t>Free users effectively can only chat with Echo from the dedicated Money Chat screen; the floating Echo button on Budget/Pulse/Savings/Subscriptions/Wallet is locked for them (askEchoPerScreen:false, tiers.ts:60) and opens the paywall. Note the metered AI cap stays finite even at Premium (1500/mo) by design — cost-metered features never go unlimited (tiers.ts:9-12,29-31). The reset is monthly for AI calls (there is no daily-chat concept); the only daily concept is the optional check-in greeting, which doesn't consume the quota. ECHO'S NOTEBOOK (added 2026-07-28): Echo's per-user 'memory' is a local learning store (src/store/learningStore.ts + learningPure.ts), NOT AI training — four capped tables (category / person-alias / wallet / type-correction, max 100 entries each, lowest-count eviction) filled from the user's own corrections in ~10 spots (receipt review, chat edits, transaction edits, quick add, notes). A rule is only trusted at count≥2, so one accident can't poison it; correcting a rule demotes it (-2) and ~2 overrides forget it, so changed habits win. Learned rules auto-fill categories in receipts/quick-add/chat and are injected into Echo's prompt (getPromptHints, moneyChat.ts:939) at zero extra AI cost. The notebook lives on the phone + the user's own cloud sync (getSyncData/applySyncedLearning); chat text is never uploaded. It is entirely FREE for every tier — no gate, no quota (no PaywallModal import in EchoNotebook.tsx); the only tier-related behavior is that the rules feed the same metered Echo chat described above.</w:t>
       </w:r>
     </w:p>
     <w:p>
@@ -4836,6 +4844,88 @@
                 <w:sz w:val="20"/>
               </w:rPr>
               <w:t>Nothing changes in this card when a limit is hit — it has no enforcement branch. The counters simply read e.g. "15/15"; no action is blocked and the paywall does not auto-open. Actual scan/AI gating lives in the feature flows elsewhere, not here. This is a status + manual-upsell surface only.</w:t>
+            </w:r>
+          </w:p>
+        </w:tc>
+      </w:tr>
+      <w:tr>
+        <w:tc>
+          <w:tcPr>
+            <w:tcW w:type="dxa" w:w="2448"/>
+            <w:shd w:val="clear" w:fill="F3F3EE"/>
+          </w:tcPr>
+          <w:p>
+            <w:r/>
+            <w:r>
+              <w:rPr>
+                <w:b w:val="0"/>
+                <w:sz w:val="20"/>
+              </w:rPr>
+              <w:t>Echo's Notebook (settings)</w:t>
+            </w:r>
+          </w:p>
+        </w:tc>
+        <w:tc>
+          <w:tcPr>
+            <w:tcW w:type="dxa" w:w="864"/>
+            <w:shd w:val="clear" w:fill="F3F3EE"/>
+          </w:tcPr>
+          <w:p>
+            <w:r/>
+            <w:r>
+              <w:rPr>
+                <w:b w:val="0"/>
+                <w:sz w:val="20"/>
+              </w:rPr>
+              <w:t>—</w:t>
+            </w:r>
+          </w:p>
+        </w:tc>
+        <w:tc>
+          <w:tcPr>
+            <w:tcW w:type="dxa" w:w="2016"/>
+            <w:shd w:val="clear" w:fill="F3F3EE"/>
+          </w:tcPr>
+          <w:p>
+            <w:r/>
+            <w:r>
+              <w:rPr>
+                <w:b w:val="0"/>
+                <w:sz w:val="20"/>
+              </w:rPr>
+              <w:t>No limit</w:t>
+            </w:r>
+          </w:p>
+        </w:tc>
+        <w:tc>
+          <w:tcPr>
+            <w:tcW w:type="dxa" w:w="1296"/>
+            <w:shd w:val="clear" w:fill="F3F3EE"/>
+          </w:tcPr>
+          <w:p>
+            <w:r/>
+            <w:r>
+              <w:rPr>
+                <w:b w:val="0"/>
+                <w:sz w:val="20"/>
+              </w:rPr>
+              <w:t>—</w:t>
+            </w:r>
+          </w:p>
+        </w:tc>
+        <w:tc>
+          <w:tcPr>
+            <w:tcW w:type="dxa" w:w="2880"/>
+            <w:shd w:val="clear" w:fill="F3F3EE"/>
+          </w:tcPr>
+          <w:p>
+            <w:r/>
+            <w:r>
+              <w:rPr>
+                <w:b w:val="0"/>
+                <w:sz w:val="20"/>
+              </w:rPr>
+              <w:t>N/A — there is no limit. All tiers can view the counter + rules, filter by type, teach custom rules (instantly trusted), edit/forget any rule, and reset the notebook.</w:t>
             </w:r>
           </w:p>
         </w:tc>
@@ -6089,6 +6179,16 @@
     <w:p>
       <w:r>
         <w:rPr>
+          <w:b w:val="0"/>
+          <w:i w:val="0"/>
+          <w:sz w:val="20"/>
+        </w:rPr>
+        <w:t>• Echo's Notebook (settings) — The visible surface of Echo's learning notebook (MAKIN_KENAL flagship): a read/edit render of learningStore's four rule tables (category / person-alias / wallet / type-correction) with per-rule counts, split into trusted (count&gt;=TRUST_COUNT) and still-learning sections. Manual 'teach a rule' writes learnCategory/learnWallet/learnPersonAlias with startCount=TRUST_COUNT (instantly trusted — no 2-correction wait); row edit = forget + re-learn; forget/reset remove rules so Echo stops using them immediately. No AI call happens on this screen — the rules it edits later feed Echo's prompt (getPromptHints, moneyChat.ts:939) and the capture paths' auto-fills at zero AI cost. Rules persist on-device + the user's own cloud sync (learningStore getSyncData/applySyncedLearning); chat text is never uploaded. Entry point: Personal Settings hub row (PersonalSettings.tsx). Reached via 'EchoNotebook' nav route registered in RootNavigator.tsx.</w:t>
+      </w:r>
+    </w:p>
+    <w:p>
+      <w:r>
+        <w:rPr>
           <w:b/>
           <w:color w:val="4F5104"/>
           <w:sz w:val="34"/>

</xml_diff>

<commit_message>
docs: guide marks Google Docs sync as planned; tick AUGUST cleanup items
Google Docs sync was pulled from the paywall (App Store 2.1) — update the
founder guide so it no longer reads as a delivered Pro benefit: moved to the
"roadmap adds" line, dropped from the free tier's differentiators, and the
limits-table note flags it UNBUILT + planned. Regenerated the docx from data.json.
Also ticked the completed permission/expo-audio/paywall-copy items in AUGUST.md.

Co-Authored-By: Claude Opus 4.8 (1M context) <noreply@anthropic.com>
</commit_message>
<xml_diff>
--- a/Potraces_Subscription_and_Echo_Guide.docx
+++ b/Potraces_Subscription_and_Echo_Guide.docx
@@ -286,7 +286,7 @@
                 <w:b w:val="0"/>
                 <w:sz w:val="20"/>
               </w:rPr>
-              <w:t>The capped baseline: tight count caps (7 wallets, 5 budgets, 3 savings/goals/shared-subs) and low metered use (15 scans/mo, 30 AI calls/mo, 50 saved chat bubbles that lock when exceeded); no cloud backup, no Ask-Echo-per-screen, no Google Docs sync.</w:t>
+              <w:t>The capped baseline: tight count caps (7 wallets, 5 budgets, 3 savings/goals/shared-subs) and low metered use (15 scans/mo, 30 AI calls/mo, 50 saved chat bubbles that lock when exceeded); no cloud backup, no Ask-Echo-per-screen.</w:t>
             </w:r>
           </w:p>
         </w:tc>
@@ -476,7 +476,7 @@
                 <w:b w:val="0"/>
                 <w:sz w:val="20"/>
               </w:rPr>
-              <w:t>For power users: all COUNT features go unlimited (wallets/budgets/savings/goals/shared-subs/playbooks) plus Google Docs sync and unlimited Collectz sessions; metered use raised to 150 scans/mo &amp; 800 AI/mo; roadmap adds remove-branding, store templates, AI preview.</w:t>
+              <w:t>For power users: all COUNT features go unlimited (wallets/budgets/savings/goals/shared-subs/playbooks) plus unlimited Collectz sessions; metered use raised to 150 scans/mo &amp; 800 AI/mo; roadmap adds Google Docs sync, remove-branding, store templates, AI preview.</w:t>
             </w:r>
           </w:p>
         </w:tc>
@@ -2702,7 +2702,7 @@
                 <w:b w:val="0"/>
                 <w:sz w:val="20"/>
               </w:rPr>
-              <w:t>tiers.ts:59,69,79,89. Pro+ only (off on free AND basic).</w:t>
+              <w:t>tiers.ts:59,69,79,89 flag Pro+ only, but the feature is UNBUILT — no sync code exists, and it was pulled from the paywall on 2026-07-29 (App Store 2.1: no advertising unbuilt features). Planned for a later update.</w:t>
             </w:r>
           </w:p>
         </w:tc>

</xml_diff>